<commit_message>
compared my model to models using the same classifiers on different papers/studies
</commit_message>
<xml_diff>
--- a/Project Spam Email Detector.docx
+++ b/Project Spam Email Detector.docx
@@ -7627,6 +7627,9 @@
         <w:keepNext/>
       </w:pPr>
       <w:r>
+        <w:rPr>
+          <w:noProof/>
+        </w:rPr>
         <w:drawing>
           <wp:inline distT="0" distB="0" distL="0" distR="0" wp14:anchorId="43F72900" wp14:editId="09A8EF63">
             <wp:extent cx="5731510" cy="1978660"/>
@@ -7696,6 +7699,9 @@
         <w:keepNext/>
       </w:pPr>
       <w:r>
+        <w:rPr>
+          <w:noProof/>
+        </w:rPr>
         <w:drawing>
           <wp:inline distT="0" distB="0" distL="0" distR="0" wp14:anchorId="52E0B345" wp14:editId="428A1D20">
             <wp:extent cx="4041255" cy="1352550"/>
@@ -7747,6 +7753,9 @@
         <w:keepNext/>
       </w:pPr>
       <w:r>
+        <w:rPr>
+          <w:noProof/>
+        </w:rPr>
         <w:drawing>
           <wp:inline distT="0" distB="0" distL="0" distR="0" wp14:anchorId="1E625663" wp14:editId="45F70BD3">
             <wp:extent cx="5731510" cy="1125220"/>
@@ -7838,6 +7847,9 @@
         <w:keepNext/>
       </w:pPr>
       <w:r>
+        <w:rPr>
+          <w:noProof/>
+        </w:rPr>
         <w:lastRenderedPageBreak/>
         <w:drawing>
           <wp:inline distT="0" distB="0" distL="0" distR="0" wp14:anchorId="5BB23C41" wp14:editId="2E5B57BA">
@@ -7890,6 +7902,9 @@
         <w:keepNext/>
       </w:pPr>
       <w:r>
+        <w:rPr>
+          <w:noProof/>
+        </w:rPr>
         <w:drawing>
           <wp:inline distT="0" distB="0" distL="0" distR="0" wp14:anchorId="122AD60A" wp14:editId="106202B9">
             <wp:extent cx="1549480" cy="1606633"/>
@@ -7941,6 +7956,9 @@
         <w:keepNext/>
       </w:pPr>
       <w:r>
+        <w:rPr>
+          <w:noProof/>
+        </w:rPr>
         <w:drawing>
           <wp:inline distT="0" distB="0" distL="0" distR="0" wp14:anchorId="473D2A1F" wp14:editId="1085BA23">
             <wp:extent cx="3797495" cy="1714588"/>
@@ -7996,6 +8014,9 @@
         <w:keepNext/>
       </w:pPr>
       <w:r>
+        <w:rPr>
+          <w:noProof/>
+        </w:rPr>
         <w:lastRenderedPageBreak/>
         <w:drawing>
           <wp:inline distT="0" distB="0" distL="0" distR="0" wp14:anchorId="17E10DA5" wp14:editId="2FD527C4">
@@ -8058,6 +8079,9 @@
         <w:keepNext/>
       </w:pPr>
       <w:r>
+        <w:rPr>
+          <w:noProof/>
+        </w:rPr>
         <w:drawing>
           <wp:inline distT="0" distB="0" distL="0" distR="0" wp14:anchorId="6362AE42" wp14:editId="0C84F1D1">
             <wp:extent cx="6094693" cy="514350"/>
@@ -8120,6 +8144,9 @@
         <w:keepNext/>
       </w:pPr>
       <w:r>
+        <w:rPr>
+          <w:noProof/>
+        </w:rPr>
         <w:drawing>
           <wp:inline distT="0" distB="0" distL="0" distR="0" wp14:anchorId="35A85534" wp14:editId="3DB9012B">
             <wp:extent cx="5731510" cy="457200"/>
@@ -8175,6 +8202,9 @@
         <w:keepNext/>
       </w:pPr>
       <w:r>
+        <w:rPr>
+          <w:noProof/>
+        </w:rPr>
         <w:drawing>
           <wp:inline distT="0" distB="0" distL="0" distR="0" wp14:anchorId="62319B3A" wp14:editId="6878B283">
             <wp:extent cx="6115941" cy="444500"/>
@@ -8230,6 +8260,9 @@
         <w:keepNext/>
       </w:pPr>
       <w:r>
+        <w:rPr>
+          <w:noProof/>
+        </w:rPr>
         <w:drawing>
           <wp:inline distT="0" distB="0" distL="0" distR="0" wp14:anchorId="6BA9AA6B" wp14:editId="0E3BAFB5">
             <wp:extent cx="5731510" cy="425450"/>
@@ -8297,6 +8330,9 @@
         <w:keepNext/>
       </w:pPr>
       <w:r>
+        <w:rPr>
+          <w:noProof/>
+        </w:rPr>
         <w:drawing>
           <wp:inline distT="0" distB="0" distL="0" distR="0" wp14:anchorId="6D77B75B" wp14:editId="24C21978">
             <wp:extent cx="3257717" cy="1244664"/>
@@ -8350,6 +8386,1206 @@
     <w:p>
       <w:r>
         <w:t>The final SVM classifier was additionally evaluated using 30 manually created emails that were completely independent from the original dataset. The model achieved an accuracy of 86.67%, which was lower than the 98.21% achieved on the original test set. Spam recall also decreased from 0.87 to 0.73. Four spam emails were incorrectly classified as legitimate, while no legitimate emails were incorrectly classified as spam. This suggests that although the classifier performs strongly on data following the patterns present within the original dataset, its performance decreases when exposed to different wording and potentially unseen patterns. The results highlight a limitation of relying on a single dataset and demonstrate the importance of evaluating machine-learning models on independent data.</w:t>
+      </w:r>
+    </w:p>
+    <w:p/>
+    <w:p>
+      <w:pPr>
+        <w:rPr>
+          <w:u w:val="single"/>
+        </w:rPr>
+      </w:pPr>
+      <w:r>
+        <w:rPr>
+          <w:u w:val="single"/>
+        </w:rPr>
+        <w:t>Comparing my Spam Detector Model with Existing Research:</w:t>
+      </w:r>
+    </w:p>
+    <w:p>
+      <w:r>
+        <w:t xml:space="preserve">With this, </w:t>
+      </w:r>
+      <w:r>
+        <w:t>it is to find out how this current approach compare with other Machine Learning approaches to spam detection, and why might the results differ.</w:t>
+      </w:r>
+    </w:p>
+    <w:p>
+      <w:r>
+        <w:t>Paper 1: Enhancing Spam Email Detection with Machine Learning: A Comparative Study of Logistic Regression and Naïve Bayes Using Apache Spark by Zhaoyang Ye (November 2024).</w:t>
+      </w:r>
+    </w:p>
+    <w:p>
+      <w:hyperlink r:id="rId96" w:history="1">
+        <w:r>
+          <w:rPr>
+            <w:rStyle w:val="Hyperlink"/>
+          </w:rPr>
+          <w:t>https://www.researchgate.net/publication/387716584_Enhancing_Spam_Email_Detection_with_Machine_Learning_A_Comparative_Study_of_Logistic_Regression_and_Naive_Bayes_Using_Apache_Spark</w:t>
+        </w:r>
+      </w:hyperlink>
+    </w:p>
+    <w:p>
+      <w:r>
+        <w:t>Citation and Abstract of this paper:</w:t>
+      </w:r>
+    </w:p>
+    <w:p>
+      <w:r>
+        <w:lastRenderedPageBreak/>
+        <w:t>Ye, Zhaoyang. (2024). Enhancing Spam Email Detection with Machine Learning: A Comparative Study of Logistic Regression and Naive Bayes Using Apache Spark. Transactions on Computer Science and Intelligent Systems Research. 7. 78-85. 10.62051/gt8zn492.</w:t>
+      </w:r>
+    </w:p>
+    <w:p>
+      <w:r>
+        <w:t xml:space="preserve"> The spread of spam emails presents serious problems for both email security and user experience. This research aims to develop an effective spam email classification system utilizing machine learning techniques, specifically Logistic Regression and Naive Bayes, within the Apache Spark framework. The methodology encompasses a thorough preprocessing of the Enron email dataset. This process involves several critical steps: text cleaning to remove irrelevant information, tokenization to break down the text into individual words, removal of stop words to eliminate common but uninformative words, and text feature extraction using Term Frequency-Inverse Document Frequency (TF-IDF) to quantify the importance of terms within the dataset. The study is conducted on a subset of the Enron email dataset, comprising 11,029 emails, with 2,996 </w:t>
+      </w:r>
+      <w:proofErr w:type="spellStart"/>
+      <w:r>
+        <w:t>labeled</w:t>
+      </w:r>
+      <w:proofErr w:type="spellEnd"/>
+      <w:r>
+        <w:t xml:space="preserve"> as spam. Experimental results demonstrate that the Naive Bayes model outperforms Logistic Regression, achieving higher accuracy and F1 score. This finding underscores the robustness of Naive Bayes in spam email classification, highlighting its potential for enhancing email security by effectively filtering spam.</w:t>
+      </w:r>
+    </w:p>
+    <w:p>
+      <w:pPr>
+        <w:rPr>
+          <w:u w:val="single"/>
+        </w:rPr>
+      </w:pPr>
+      <w:r>
+        <w:rPr>
+          <w:u w:val="single"/>
+        </w:rPr>
+        <w:t>Comparison of Paper 1:</w:t>
+      </w:r>
+    </w:p>
+    <w:p>
+      <w:r>
+        <w:t>With this paper, it is useful as it directly compares two of the same models I have already tested with that being Logistic Regression and Naïve Bayes, and it also uses TF-IDF. The only downside is that is does not utilise SVM however, the next paper that will be featured does use such classifier.</w:t>
+      </w:r>
+    </w:p>
+    <w:p>
+      <w:r>
+        <w:t>In terms of their methodology compared with the models used in this paper, Ye used an Enron subset as their choice of dataset with a size of 11,029 emails with 2,996 of them being spam. Compared with this one, it used a Kaggle Spam Email dataset with 5,572 emails with 747 of them being classed as spam. In terms of text processing, Ye used Lowercase, punctuation removal, stop words and tokenisation. For their choice of feature extraction, it used TF-IDF. When compared with the latter, for text processing, the processing method choice was TF-IDF-based preprocessing and for feature extraction, TF-IDF was used as well.</w:t>
+      </w:r>
+      <w:r>
+        <w:t xml:space="preserve"> For the evaluation process there are similarities as for both papers, it used Accuracy, Precision, Recall, F1 however, the main differences is that for the former (Ye). Another method that was used for evaluation was ROC/AUC.</w:t>
+      </w:r>
+    </w:p>
+    <w:p>
+      <w:r>
+        <w:t>To summarise, the important similarity that makes a comparison fair is that both studies implement TF-IDF and directly compare Logistic Regression with Naïve Bayes.</w:t>
+      </w:r>
+    </w:p>
+    <w:p>
+      <w:r>
+        <w:t>The following figure is the results of Ye’s model:</w:t>
+      </w:r>
+    </w:p>
+    <w:p>
+      <w:pPr>
+        <w:keepNext/>
+      </w:pPr>
+      <w:r>
+        <w:lastRenderedPageBreak/>
+        <w:drawing>
+          <wp:inline distT="0" distB="0" distL="0" distR="0" wp14:anchorId="31D1117F" wp14:editId="3C98FDAB">
+            <wp:extent cx="3683189" cy="2076557"/>
+            <wp:effectExtent l="0" t="0" r="0" b="0"/>
+            <wp:docPr id="551670475" name="Picture 1"/>
+            <wp:cNvGraphicFramePr>
+              <a:graphicFrameLocks xmlns:a="http://schemas.openxmlformats.org/drawingml/2006/main" noChangeAspect="1"/>
+            </wp:cNvGraphicFramePr>
+            <a:graphic xmlns:a="http://schemas.openxmlformats.org/drawingml/2006/main">
+              <a:graphicData uri="http://schemas.openxmlformats.org/drawingml/2006/picture">
+                <pic:pic xmlns:pic="http://schemas.openxmlformats.org/drawingml/2006/picture">
+                  <pic:nvPicPr>
+                    <pic:cNvPr id="551670475" name=""/>
+                    <pic:cNvPicPr/>
+                  </pic:nvPicPr>
+                  <pic:blipFill>
+                    <a:blip r:embed="rId97"/>
+                    <a:stretch>
+                      <a:fillRect/>
+                    </a:stretch>
+                  </pic:blipFill>
+                  <pic:spPr>
+                    <a:xfrm>
+                      <a:off x="0" y="0"/>
+                      <a:ext cx="3683189" cy="2076557"/>
+                    </a:xfrm>
+                    <a:prstGeom prst="rect">
+                      <a:avLst/>
+                    </a:prstGeom>
+                  </pic:spPr>
+                </pic:pic>
+              </a:graphicData>
+            </a:graphic>
+          </wp:inline>
+        </w:drawing>
+      </w:r>
+    </w:p>
+    <w:p>
+      <w:pPr>
+        <w:pStyle w:val="Caption"/>
+      </w:pPr>
+      <w:r>
+        <w:t>Figure 96 performance metrics of Ye's Studies</w:t>
+      </w:r>
+    </w:p>
+    <w:p>
+      <w:r>
+        <w:t>Their conclusion was that Naïve Bayes outperformed Logistic Regression across the reported metrics.</w:t>
+      </w:r>
+    </w:p>
+    <w:p>
+      <w:r>
+        <w:t>When compared to the results of this studies’ performance of the models:</w:t>
+      </w:r>
+    </w:p>
+    <w:tbl>
+      <w:tblPr>
+        <w:tblStyle w:val="TableGrid"/>
+        <w:tblW w:w="0" w:type="auto"/>
+        <w:tblLook w:val="04A0" w:firstRow="1" w:lastRow="0" w:firstColumn="1" w:lastColumn="0" w:noHBand="0" w:noVBand="1"/>
+      </w:tblPr>
+      <w:tblGrid>
+        <w:gridCol w:w="3005"/>
+        <w:gridCol w:w="3005"/>
+        <w:gridCol w:w="3006"/>
+      </w:tblGrid>
+      <w:tr>
+        <w:tc>
+          <w:tcPr>
+            <w:tcW w:w="3005" w:type="dxa"/>
+            <w:tcBorders>
+              <w:bottom w:val="single" w:sz="4" w:space="0" w:color="auto"/>
+              <w:right w:val="nil"/>
+            </w:tcBorders>
+          </w:tcPr>
+          <w:p>
+            <w:pPr>
+              <w:jc w:val="center"/>
+              <w:rPr>
+                <w:b/>
+                <w:bCs/>
+              </w:rPr>
+            </w:pPr>
+            <w:r>
+              <w:rPr>
+                <w:b/>
+                <w:bCs/>
+              </w:rPr>
+              <w:t>Model</w:t>
+            </w:r>
+          </w:p>
+        </w:tc>
+        <w:tc>
+          <w:tcPr>
+            <w:tcW w:w="3005" w:type="dxa"/>
+            <w:tcBorders>
+              <w:left w:val="nil"/>
+              <w:right w:val="nil"/>
+            </w:tcBorders>
+          </w:tcPr>
+          <w:p>
+            <w:pPr>
+              <w:jc w:val="center"/>
+              <w:rPr>
+                <w:b/>
+                <w:bCs/>
+              </w:rPr>
+            </w:pPr>
+            <w:r>
+              <w:rPr>
+                <w:b/>
+                <w:bCs/>
+              </w:rPr>
+              <w:t>This Study</w:t>
+            </w:r>
+          </w:p>
+        </w:tc>
+        <w:tc>
+          <w:tcPr>
+            <w:tcW w:w="3006" w:type="dxa"/>
+            <w:tcBorders>
+              <w:left w:val="nil"/>
+              <w:right w:val="single" w:sz="4" w:space="0" w:color="auto"/>
+            </w:tcBorders>
+          </w:tcPr>
+          <w:p>
+            <w:pPr>
+              <w:jc w:val="center"/>
+              <w:rPr>
+                <w:b/>
+                <w:bCs/>
+              </w:rPr>
+            </w:pPr>
+            <w:r>
+              <w:rPr>
+                <w:b/>
+                <w:bCs/>
+              </w:rPr>
+              <w:t>Ye’s Paper</w:t>
+            </w:r>
+          </w:p>
+        </w:tc>
+      </w:tr>
+      <w:tr>
+        <w:tc>
+          <w:tcPr>
+            <w:tcW w:w="3005" w:type="dxa"/>
+            <w:tcBorders>
+              <w:right w:val="single" w:sz="4" w:space="0" w:color="auto"/>
+            </w:tcBorders>
+          </w:tcPr>
+          <w:p>
+            <w:pPr>
+              <w:jc w:val="center"/>
+            </w:pPr>
+            <w:r>
+              <w:t>Logistic Regression</w:t>
+            </w:r>
+          </w:p>
+        </w:tc>
+        <w:tc>
+          <w:tcPr>
+            <w:tcW w:w="3005" w:type="dxa"/>
+            <w:tcBorders>
+              <w:left w:val="single" w:sz="4" w:space="0" w:color="auto"/>
+            </w:tcBorders>
+          </w:tcPr>
+          <w:p>
+            <w:pPr>
+              <w:jc w:val="center"/>
+            </w:pPr>
+            <w:r>
+              <w:t>96.14%</w:t>
+            </w:r>
+          </w:p>
+        </w:tc>
+        <w:tc>
+          <w:tcPr>
+            <w:tcW w:w="3006" w:type="dxa"/>
+          </w:tcPr>
+          <w:p>
+            <w:pPr>
+              <w:jc w:val="center"/>
+            </w:pPr>
+            <w:r>
+              <w:t>96.18%</w:t>
+            </w:r>
+          </w:p>
+        </w:tc>
+      </w:tr>
+      <w:tr>
+        <w:tc>
+          <w:tcPr>
+            <w:tcW w:w="3005" w:type="dxa"/>
+          </w:tcPr>
+          <w:p>
+            <w:pPr>
+              <w:jc w:val="center"/>
+            </w:pPr>
+            <w:r>
+              <w:t>Naïve Bayes</w:t>
+            </w:r>
+          </w:p>
+        </w:tc>
+        <w:tc>
+          <w:tcPr>
+            <w:tcW w:w="3005" w:type="dxa"/>
+          </w:tcPr>
+          <w:p>
+            <w:pPr>
+              <w:jc w:val="center"/>
+            </w:pPr>
+            <w:r>
+              <w:t>97.22%</w:t>
+            </w:r>
+          </w:p>
+        </w:tc>
+        <w:tc>
+          <w:tcPr>
+            <w:tcW w:w="3006" w:type="dxa"/>
+          </w:tcPr>
+          <w:p>
+            <w:pPr>
+              <w:jc w:val="center"/>
+            </w:pPr>
+            <w:r>
+              <w:t>98.73%</w:t>
+            </w:r>
+          </w:p>
+        </w:tc>
+      </w:tr>
+      <w:tr>
+        <w:tc>
+          <w:tcPr>
+            <w:tcW w:w="3005" w:type="dxa"/>
+          </w:tcPr>
+          <w:p>
+            <w:pPr>
+              <w:jc w:val="center"/>
+            </w:pPr>
+            <w:r>
+              <w:t>SVM</w:t>
+            </w:r>
+          </w:p>
+        </w:tc>
+        <w:tc>
+          <w:tcPr>
+            <w:tcW w:w="3005" w:type="dxa"/>
+          </w:tcPr>
+          <w:p>
+            <w:pPr>
+              <w:jc w:val="center"/>
+            </w:pPr>
+            <w:r>
+              <w:t>98.21%</w:t>
+            </w:r>
+          </w:p>
+        </w:tc>
+        <w:tc>
+          <w:tcPr>
+            <w:tcW w:w="3006" w:type="dxa"/>
+          </w:tcPr>
+          <w:p>
+            <w:pPr>
+              <w:jc w:val="center"/>
+            </w:pPr>
+            <w:r>
+              <w:t>N/A</w:t>
+            </w:r>
+          </w:p>
+        </w:tc>
+      </w:tr>
+    </w:tbl>
+    <w:p/>
+    <w:p>
+      <w:r>
+        <w:t>What we can gather from this table is that the Logistic Regression result identical, which is a strong point for this study as despite using different datasets and implementation, the Logistic Regression accuracy was remarkably similar. The Logistic Regression model with the accuracy of 96.14% and the 96.18% reported by Ye (2024). Also provides supporting evidence for the effectiveness of Logistic Regression in TF-IDF-based spam classification.</w:t>
+      </w:r>
+    </w:p>
+    <w:p>
+      <w:r>
+        <w:t>In terms of chiming in on the accuracy, precision, recall, and F1 for Naïve Bayes, the Naïve Bayes</w:t>
+      </w:r>
+      <w:r>
+        <w:t xml:space="preserve"> model used here recorded an accuracy of 97.22%, a spam precision of 1.00, a spam recall of 0.79, and a spam F1 of 0.88. The results of Naïve Bayes reported by Ye (2024) had an accuracy of 98.73%, a precision of 97.54%, a recall of 97.86%, and an F1 score of 97.70%.</w:t>
+      </w:r>
+    </w:p>
+    <w:p>
+      <w:r>
+        <w:t>The Naïve Bayes model in Ye’s study achieved higher overall performance than the Naïve bayes model developed in this project. However, direct comparison should be interpreted cautiously because the studies used different datasets and preprocessing approaches. Dataset characteristics, class distributions, and evaluation procedures can substantially influence classification performance.</w:t>
+      </w:r>
+    </w:p>
+    <w:p>
+      <w:r>
+        <w:t xml:space="preserve">One other thing that can be pointed out from both studies is that it reached the same verdict in terms of that Naïve Bayes outperformed Logistic Regression for spam classification using TF-IDF-based features. </w:t>
+      </w:r>
+    </w:p>
+    <w:p>
+      <w:r>
+        <w:t>With Ye’s study, it only utilised two classifiers with Naïve Bayes and Logistic Regression whereas with this one it added a third with SVM. SVM was also the best model performance wise when it came to comparing the three models.</w:t>
+      </w:r>
+    </w:p>
+    <w:p>
+      <w:r>
+        <w:t>Here are the finding when comparing SVM to the best performing model in Ye’s paper with it being Naïve Bayes:</w:t>
+      </w:r>
+    </w:p>
+    <w:tbl>
+      <w:tblPr>
+        <w:tblStyle w:val="TableGrid"/>
+        <w:tblW w:w="0" w:type="auto"/>
+        <w:tblLook w:val="04A0" w:firstRow="1" w:lastRow="0" w:firstColumn="1" w:lastColumn="0" w:noHBand="0" w:noVBand="1"/>
+      </w:tblPr>
+      <w:tblGrid>
+        <w:gridCol w:w="3005"/>
+        <w:gridCol w:w="3005"/>
+        <w:gridCol w:w="3006"/>
+      </w:tblGrid>
+      <w:tr>
+        <w:tc>
+          <w:tcPr>
+            <w:tcW w:w="3005" w:type="dxa"/>
+            <w:tcBorders>
+              <w:right w:val="nil"/>
+            </w:tcBorders>
+          </w:tcPr>
+          <w:p>
+            <w:pPr>
+              <w:jc w:val="center"/>
+              <w:rPr>
+                <w:b/>
+                <w:bCs/>
+              </w:rPr>
+            </w:pPr>
+            <w:r>
+              <w:rPr>
+                <w:b/>
+                <w:bCs/>
+              </w:rPr>
+              <w:lastRenderedPageBreak/>
+              <w:t>Metric</w:t>
+            </w:r>
+          </w:p>
+        </w:tc>
+        <w:tc>
+          <w:tcPr>
+            <w:tcW w:w="3005" w:type="dxa"/>
+            <w:tcBorders>
+              <w:left w:val="nil"/>
+              <w:bottom w:val="single" w:sz="4" w:space="0" w:color="auto"/>
+              <w:right w:val="nil"/>
+            </w:tcBorders>
+          </w:tcPr>
+          <w:p>
+            <w:pPr>
+              <w:jc w:val="center"/>
+              <w:rPr>
+                <w:b/>
+                <w:bCs/>
+              </w:rPr>
+            </w:pPr>
+            <w:r>
+              <w:rPr>
+                <w:b/>
+                <w:bCs/>
+              </w:rPr>
+              <w:t>SVM</w:t>
+            </w:r>
+          </w:p>
+        </w:tc>
+        <w:tc>
+          <w:tcPr>
+            <w:tcW w:w="3006" w:type="dxa"/>
+            <w:tcBorders>
+              <w:left w:val="nil"/>
+            </w:tcBorders>
+          </w:tcPr>
+          <w:p>
+            <w:pPr>
+              <w:jc w:val="center"/>
+              <w:rPr>
+                <w:b/>
+                <w:bCs/>
+              </w:rPr>
+            </w:pPr>
+            <w:r>
+              <w:rPr>
+                <w:b/>
+                <w:bCs/>
+              </w:rPr>
+              <w:t>Naïve Bayes (Ye)</w:t>
+            </w:r>
+          </w:p>
+        </w:tc>
+      </w:tr>
+      <w:tr>
+        <w:tc>
+          <w:tcPr>
+            <w:tcW w:w="3005" w:type="dxa"/>
+          </w:tcPr>
+          <w:p>
+            <w:pPr>
+              <w:jc w:val="center"/>
+            </w:pPr>
+            <w:r>
+              <w:t>Accuracy</w:t>
+            </w:r>
+          </w:p>
+        </w:tc>
+        <w:tc>
+          <w:tcPr>
+            <w:tcW w:w="3005" w:type="dxa"/>
+            <w:tcBorders>
+              <w:top w:val="single" w:sz="4" w:space="0" w:color="auto"/>
+            </w:tcBorders>
+          </w:tcPr>
+          <w:p>
+            <w:pPr>
+              <w:jc w:val="center"/>
+            </w:pPr>
+            <w:r>
+              <w:t>98.21%</w:t>
+            </w:r>
+          </w:p>
+        </w:tc>
+        <w:tc>
+          <w:tcPr>
+            <w:tcW w:w="3006" w:type="dxa"/>
+          </w:tcPr>
+          <w:p>
+            <w:pPr>
+              <w:jc w:val="center"/>
+            </w:pPr>
+            <w:r>
+              <w:t>98.73%</w:t>
+            </w:r>
+          </w:p>
+        </w:tc>
+      </w:tr>
+      <w:tr>
+        <w:tc>
+          <w:tcPr>
+            <w:tcW w:w="3005" w:type="dxa"/>
+          </w:tcPr>
+          <w:p>
+            <w:pPr>
+              <w:jc w:val="center"/>
+            </w:pPr>
+            <w:r>
+              <w:t>Spam Precision</w:t>
+            </w:r>
+          </w:p>
+        </w:tc>
+        <w:tc>
+          <w:tcPr>
+            <w:tcW w:w="3005" w:type="dxa"/>
+          </w:tcPr>
+          <w:p>
+            <w:pPr>
+              <w:jc w:val="center"/>
+            </w:pPr>
+            <w:r>
+              <w:t>0.99</w:t>
+            </w:r>
+          </w:p>
+        </w:tc>
+        <w:tc>
+          <w:tcPr>
+            <w:tcW w:w="3006" w:type="dxa"/>
+          </w:tcPr>
+          <w:p>
+            <w:pPr>
+              <w:jc w:val="center"/>
+            </w:pPr>
+            <w:r>
+              <w:t>0.9754</w:t>
+            </w:r>
+          </w:p>
+        </w:tc>
+      </w:tr>
+      <w:tr>
+        <w:tc>
+          <w:tcPr>
+            <w:tcW w:w="3005" w:type="dxa"/>
+          </w:tcPr>
+          <w:p>
+            <w:pPr>
+              <w:jc w:val="center"/>
+            </w:pPr>
+            <w:r>
+              <w:t>Spam Recall</w:t>
+            </w:r>
+          </w:p>
+        </w:tc>
+        <w:tc>
+          <w:tcPr>
+            <w:tcW w:w="3005" w:type="dxa"/>
+          </w:tcPr>
+          <w:p>
+            <w:pPr>
+              <w:jc w:val="center"/>
+            </w:pPr>
+            <w:r>
+              <w:t>0.87</w:t>
+            </w:r>
+          </w:p>
+        </w:tc>
+        <w:tc>
+          <w:tcPr>
+            <w:tcW w:w="3006" w:type="dxa"/>
+          </w:tcPr>
+          <w:p>
+            <w:pPr>
+              <w:jc w:val="center"/>
+            </w:pPr>
+            <w:r>
+              <w:t>0.9786</w:t>
+            </w:r>
+          </w:p>
+        </w:tc>
+      </w:tr>
+      <w:tr>
+        <w:tc>
+          <w:tcPr>
+            <w:tcW w:w="3005" w:type="dxa"/>
+          </w:tcPr>
+          <w:p>
+            <w:pPr>
+              <w:jc w:val="center"/>
+            </w:pPr>
+            <w:r>
+              <w:t>Spam F1</w:t>
+            </w:r>
+          </w:p>
+        </w:tc>
+        <w:tc>
+          <w:tcPr>
+            <w:tcW w:w="3005" w:type="dxa"/>
+          </w:tcPr>
+          <w:p>
+            <w:pPr>
+              <w:jc w:val="center"/>
+            </w:pPr>
+            <w:r>
+              <w:t>0.93</w:t>
+            </w:r>
+          </w:p>
+        </w:tc>
+        <w:tc>
+          <w:tcPr>
+            <w:tcW w:w="3006" w:type="dxa"/>
+          </w:tcPr>
+          <w:p>
+            <w:pPr>
+              <w:jc w:val="center"/>
+            </w:pPr>
+            <w:r>
+              <w:t>0.9770</w:t>
+            </w:r>
+          </w:p>
+        </w:tc>
+      </w:tr>
+    </w:tbl>
+    <w:p/>
+    <w:p>
+      <w:r>
+        <w:t>When it comes to overall accuracy, Ye</w:t>
+      </w:r>
+      <w:r>
+        <w:t xml:space="preserve"> (2024) had a better accuracy with a difference only being 0.52% with 98.73. In terms of precision SVM had the better result with 0.99. when it came to recall and F1 score, Naïve Bayes recorded a better result with 97.86% and 97.70% respectively.</w:t>
+      </w:r>
+    </w:p>
+    <w:p>
+      <w:r>
+        <w:t>Once again, this does not completely mean that Naïve Bayes is the superior model as different parameters were used for the model.</w:t>
+      </w:r>
+    </w:p>
+    <w:p>
+      <w:r>
+        <w:t xml:space="preserve">To summarise, </w:t>
+      </w:r>
+      <w:r>
+        <w:t>Ye (2024) compared Logistic Regression and Naive Bayes for TF-IDF-based spam email classification and found that Naive Bayes achieved superior performance. A similar pattern was observed in this project, where Naive Bayes achieved 97.22% accuracy compared with 96.14% for Logistic Regression. However, this project extended the comparison by evaluating a Support Vector Machine, which achieved the highest accuracy of 98.21%. Furthermore, an independent evaluation using manually created emails was conducted to investigate generalisation beyond the original dataset.</w:t>
+      </w:r>
+    </w:p>
+    <w:p/>
+    <w:p>
+      <w:r>
+        <w:t xml:space="preserve">Paper 2: </w:t>
+      </w:r>
+      <w:r>
+        <w:t>Meta-learner-based frameworks for interpretable email spam detection</w:t>
+      </w:r>
+      <w:r>
+        <w:t xml:space="preserve">. </w:t>
+      </w:r>
+      <w:r>
+        <w:t>Kshirsagar M, Rathi V and Ryan C (2025)</w:t>
+      </w:r>
+      <w:r>
+        <w:t>.</w:t>
+      </w:r>
+    </w:p>
+    <w:p>
+      <w:hyperlink r:id="rId98" w:history="1">
+        <w:r>
+          <w:rPr>
+            <w:rStyle w:val="Hyperlink"/>
+          </w:rPr>
+          <w:t>https://www.frontiersin.org/journals/artificial-intelligence/articles/10.3389/frai.2025.1569804/full?utm_source=chatgpt.com</w:t>
+        </w:r>
+      </w:hyperlink>
+    </w:p>
+    <w:p>
+      <w:r>
+        <w:t>Citation and Abstract of this paper:</w:t>
+      </w:r>
+    </w:p>
+    <w:p>
+      <w:r>
+        <w:t xml:space="preserve">Kshirsagar M, Rathi V and Ryan C (2025) Meta-learner-based frameworks for interpretable email spam detection. Front. </w:t>
+      </w:r>
+      <w:proofErr w:type="spellStart"/>
+      <w:r>
+        <w:t>Artif</w:t>
+      </w:r>
+      <w:proofErr w:type="spellEnd"/>
+      <w:r>
+        <w:t xml:space="preserve">. Intell. 8:1569804. </w:t>
+      </w:r>
+      <w:proofErr w:type="spellStart"/>
+      <w:r>
+        <w:t>doi</w:t>
+      </w:r>
+      <w:proofErr w:type="spellEnd"/>
+      <w:r>
+        <w:t>: 10.3389/frai.2025.1569804</w:t>
+      </w:r>
+    </w:p>
+    <w:p>
+      <w:r>
+        <w:t>Abstract</w:t>
+      </w:r>
+    </w:p>
+    <w:p>
+      <w:r>
+        <w:t>Introduction: </w:t>
+      </w:r>
+    </w:p>
+    <w:p>
+      <w:r>
+        <w:t>With the increasing reliance on digital communication, email has become an essential tool for personal and professional correspondence. However, despite its numerous benefits, digital communication faces significant challenges, particularly the prevalence of spam emails. Effective spam email classification systems are crucial to mitigate these issues by automatically identifying and filtering out unwanted messages, enhancing the efficiency of email communication.</w:t>
+      </w:r>
+    </w:p>
+    <w:p>
+      <w:r>
+        <w:t>Methods: </w:t>
+      </w:r>
+    </w:p>
+    <w:p>
+      <w:r>
+        <w:t>We compare five traditional machine-learning and five deep-learning spam classifiers against a novel meta-learner, evaluating how different word embeddings, vectorization schemes, and model architectures affect performance on the Enron-Spam and TREC 2007 datasets. The primary aim is to show how the meta-learner's combined predictions stack up against individual ML and DL approaches.</w:t>
+      </w:r>
+    </w:p>
+    <w:p>
+      <w:r>
+        <w:lastRenderedPageBreak/>
+        <w:t>Results: </w:t>
+      </w:r>
+    </w:p>
+    <w:p>
+      <w:r>
+        <w:t>Our meta-learner outperforms all state-of-the-art models, achieving an accuracy of 0.9905 and an AUC score of 0.9991 on a hybrid dataset that combines Enron-Spam and TREC 2007. To the best of our knowledge, our model also surpasses the only other meta-learning-based spam detection model reported in recent literature, with higher accuracy, better generalization from a significantly larger dataset, and lower computational complexity. We also evaluated our meta-learner in a zero-shot setting on an unseen real-world dataset, achieving a spam sensitivity rate of 0.8970 and an AUC score of 0.7605.</w:t>
+      </w:r>
+    </w:p>
+    <w:p>
+      <w:r>
+        <w:t>Discussion: </w:t>
+      </w:r>
+    </w:p>
+    <w:p>
+      <w:r>
+        <w:t>These results demonstrate that meta-learning can yield more robust, bias-resistant spam filters suited for real-world deployment. By combining complementary model strengths, the meta-learner also offers improved resilience against evolving spam tactics.</w:t>
+      </w:r>
+      <w:r>
+        <w:t xml:space="preserve"> </w:t>
+      </w:r>
+      <w:r>
+        <w:t>Kshirsagar M, Rathi V and Ryan C (2025)</w:t>
+      </w:r>
+    </w:p>
+    <w:p>
+      <w:r>
+        <w:t>With this paper, it uses Support Vector Machine with TF-IDF</w:t>
+      </w:r>
+      <w:r>
+        <w:t xml:space="preserve"> alongside XGBoost, Random Forest, Logistic Regression, and Naïve Bayes. It was also tested with bag of words and TF-IDF . SVM will be the only model that will be looked at</w:t>
+      </w:r>
+      <w:r>
+        <w:t xml:space="preserve"> as </w:t>
+      </w:r>
+      <w:r>
+        <w:t xml:space="preserve">it is </w:t>
+      </w:r>
+      <w:r>
+        <w:t>the best performing model within this study. It uses the TREC 2007 email dataset. The relevant results within their study with SVM are reported below:</w:t>
+      </w:r>
+    </w:p>
+    <w:tbl>
+      <w:tblPr>
+        <w:tblStyle w:val="TableGrid"/>
+        <w:tblW w:w="0" w:type="auto"/>
+        <w:tblLook w:val="04A0" w:firstRow="1" w:lastRow="0" w:firstColumn="1" w:lastColumn="0" w:noHBand="0" w:noVBand="1"/>
+      </w:tblPr>
+      <w:tblGrid>
+        <w:gridCol w:w="1502"/>
+        <w:gridCol w:w="1502"/>
+        <w:gridCol w:w="1503"/>
+        <w:gridCol w:w="1503"/>
+        <w:gridCol w:w="1503"/>
+        <w:gridCol w:w="1503"/>
+      </w:tblGrid>
+      <w:tr>
+        <w:tc>
+          <w:tcPr>
+            <w:tcW w:w="1502" w:type="dxa"/>
+          </w:tcPr>
+          <w:p>
+            <w:r>
+              <w:t>Model</w:t>
+            </w:r>
+          </w:p>
+        </w:tc>
+        <w:tc>
+          <w:tcPr>
+            <w:tcW w:w="1502" w:type="dxa"/>
+          </w:tcPr>
+          <w:p>
+            <w:r>
+              <w:t>Features</w:t>
+            </w:r>
+          </w:p>
+        </w:tc>
+        <w:tc>
+          <w:tcPr>
+            <w:tcW w:w="1503" w:type="dxa"/>
+          </w:tcPr>
+          <w:p>
+            <w:r>
+              <w:t>Accuracy</w:t>
+            </w:r>
+          </w:p>
+        </w:tc>
+        <w:tc>
+          <w:tcPr>
+            <w:tcW w:w="1503" w:type="dxa"/>
+          </w:tcPr>
+          <w:p>
+            <w:r>
+              <w:t>Precision</w:t>
+            </w:r>
+          </w:p>
+        </w:tc>
+        <w:tc>
+          <w:tcPr>
+            <w:tcW w:w="1503" w:type="dxa"/>
+          </w:tcPr>
+          <w:p>
+            <w:r>
+              <w:t>Recall</w:t>
+            </w:r>
+          </w:p>
+        </w:tc>
+        <w:tc>
+          <w:tcPr>
+            <w:tcW w:w="1503" w:type="dxa"/>
+          </w:tcPr>
+          <w:p>
+            <w:r>
+              <w:t>F1</w:t>
+            </w:r>
+          </w:p>
+        </w:tc>
+      </w:tr>
+      <w:tr>
+        <w:tc>
+          <w:tcPr>
+            <w:tcW w:w="1502" w:type="dxa"/>
+          </w:tcPr>
+          <w:p>
+            <w:r>
+              <w:t>SVM</w:t>
+            </w:r>
+          </w:p>
+        </w:tc>
+        <w:tc>
+          <w:tcPr>
+            <w:tcW w:w="1502" w:type="dxa"/>
+          </w:tcPr>
+          <w:p>
+            <w:r>
+              <w:t>Bag of words</w:t>
+            </w:r>
+          </w:p>
+        </w:tc>
+        <w:tc>
+          <w:tcPr>
+            <w:tcW w:w="1503" w:type="dxa"/>
+          </w:tcPr>
+          <w:p>
+            <w:r>
+              <w:t>97.53%</w:t>
+            </w:r>
+          </w:p>
+        </w:tc>
+        <w:tc>
+          <w:tcPr>
+            <w:tcW w:w="1503" w:type="dxa"/>
+          </w:tcPr>
+          <w:p>
+            <w:r>
+              <w:t>97.60%</w:t>
+            </w:r>
+          </w:p>
+        </w:tc>
+        <w:tc>
+          <w:tcPr>
+            <w:tcW w:w="1503" w:type="dxa"/>
+          </w:tcPr>
+          <w:p>
+            <w:r>
+              <w:t>98.67%</w:t>
+            </w:r>
+          </w:p>
+        </w:tc>
+        <w:tc>
+          <w:tcPr>
+            <w:tcW w:w="1503" w:type="dxa"/>
+          </w:tcPr>
+          <w:p>
+            <w:r>
+              <w:t>98.13%</w:t>
+            </w:r>
+          </w:p>
+        </w:tc>
+      </w:tr>
+      <w:tr>
+        <w:tc>
+          <w:tcPr>
+            <w:tcW w:w="1502" w:type="dxa"/>
+          </w:tcPr>
+          <w:p>
+            <w:r>
+              <w:t>SVM</w:t>
+            </w:r>
+          </w:p>
+        </w:tc>
+        <w:tc>
+          <w:tcPr>
+            <w:tcW w:w="1502" w:type="dxa"/>
+          </w:tcPr>
+          <w:p>
+            <w:r>
+              <w:t>TF-IDF</w:t>
+            </w:r>
+          </w:p>
+        </w:tc>
+        <w:tc>
+          <w:tcPr>
+            <w:tcW w:w="1503" w:type="dxa"/>
+          </w:tcPr>
+          <w:p>
+            <w:r>
+              <w:t>99.11%</w:t>
+            </w:r>
+          </w:p>
+        </w:tc>
+        <w:tc>
+          <w:tcPr>
+            <w:tcW w:w="1503" w:type="dxa"/>
+          </w:tcPr>
+          <w:p>
+            <w:r>
+              <w:t>99.06%</w:t>
+            </w:r>
+          </w:p>
+        </w:tc>
+        <w:tc>
+          <w:tcPr>
+            <w:tcW w:w="1503" w:type="dxa"/>
+          </w:tcPr>
+          <w:p>
+            <w:r>
+              <w:t>99.60%</w:t>
+            </w:r>
+          </w:p>
+        </w:tc>
+        <w:tc>
+          <w:tcPr>
+            <w:tcW w:w="1503" w:type="dxa"/>
+          </w:tcPr>
+          <w:p>
+            <w:r>
+              <w:t>99.33%</w:t>
+            </w:r>
+          </w:p>
+        </w:tc>
+      </w:tr>
+    </w:tbl>
+    <w:p/>
+    <w:p>
+      <w:r>
+        <w:t>This paper found that SVM with TF-IDF was the best performing traditional machine-learning pipeline on their experiment.</w:t>
+      </w:r>
+    </w:p>
+    <w:p>
+      <w:r>
+        <w:t xml:space="preserve">When compared to this variant of SVM being used, when it comes to accuracy this study had an accuracy of 98.21% whereas with </w:t>
+      </w:r>
+      <w:r>
+        <w:t>Kshirsagar M, Rathi V and Ryan C</w:t>
+      </w:r>
+      <w:r>
+        <w:t>’s study, they recorded an accuracy of 99.11%. when it cam to precision, there is only a 0.06 difference with their study having a precision of 99.06% compared with 99% in this study. With recall and F1 their recall had a score of 99.60% and an F1 of 99.33%. compared with this study, it recorded a recall of 87% and an f1 score of 93% respectively.</w:t>
+      </w:r>
+      <w:r>
+        <w:t xml:space="preserve"> </w:t>
+      </w:r>
+    </w:p>
+    <w:p>
+      <w:r>
+        <w:t>The difference between the two are not that stark. The accuracy within this study is only about 0.9 percentage points lower so this SVM classifier is performing very competitively when comparing the two studies based on the numbers. However, having a spam recall of 87% is noticeably lower than their reported recall.</w:t>
+      </w:r>
+    </w:p>
+    <w:p>
+      <w:r>
+        <w:t xml:space="preserve">In terms of why their SVM performs well, TF-IDF is a big reason why as </w:t>
+      </w:r>
+      <w:r>
+        <w:t>TF-IDF converts each email into numerical features based on how important particular words are.</w:t>
+      </w:r>
+      <w:r>
+        <w:t xml:space="preserve"> </w:t>
+      </w:r>
+      <w:r>
+        <w:t>For example, words that occur frequently across almost every email aren't particularly useful.</w:t>
+      </w:r>
+      <w:r>
+        <w:t xml:space="preserve"> However, </w:t>
+      </w:r>
+      <w:r>
+        <w:t xml:space="preserve"> words that are relatively distinctive can receive higher TF-IDF values.</w:t>
+      </w:r>
+    </w:p>
+    <w:p>
+      <w:r>
+        <w:t>The</w:t>
+      </w:r>
+      <w:r>
+        <w:t>ir</w:t>
+      </w:r>
+      <w:r>
+        <w:t xml:space="preserve"> paper explains that TF-IDF helps the model focus on discriminative terms rather than treating every word equally.</w:t>
+      </w:r>
+      <w:r>
+        <w:t xml:space="preserve"> </w:t>
+      </w:r>
+      <w:r>
+        <w:t>That's important because spam emails often contain distinctive vocabulary.</w:t>
+      </w:r>
+      <w:r>
+        <w:t xml:space="preserve"> </w:t>
+      </w:r>
+      <w:r>
+        <w:t>For example:</w:t>
+      </w:r>
+    </w:p>
+    <w:p>
+      <w:r>
+        <w:t>C</w:t>
+      </w:r>
+      <w:r>
+        <w:t>ongratulations</w:t>
+      </w:r>
+      <w:r>
+        <w:t xml:space="preserve">, </w:t>
+      </w:r>
+      <w:r>
+        <w:t>winner</w:t>
+      </w:r>
+      <w:r>
+        <w:t xml:space="preserve">, </w:t>
+      </w:r>
+      <w:r>
+        <w:t>prize</w:t>
+      </w:r>
+      <w:r>
+        <w:t xml:space="preserve">, </w:t>
+      </w:r>
+      <w:r>
+        <w:t>click</w:t>
+      </w:r>
+      <w:r>
+        <w:t xml:space="preserve">, </w:t>
+      </w:r>
+      <w:r>
+        <w:t>offer</w:t>
+      </w:r>
+      <w:r>
+        <w:t xml:space="preserve">, </w:t>
+      </w:r>
+      <w:r>
+        <w:t>cash</w:t>
+      </w:r>
+      <w:r>
+        <w:t xml:space="preserve">, </w:t>
+      </w:r>
+      <w:r>
+        <w:t>account</w:t>
+      </w:r>
+      <w:r>
+        <w:t xml:space="preserve">, </w:t>
+      </w:r>
+      <w:r>
+        <w:t>urgent</w:t>
+      </w:r>
+    </w:p>
+    <w:p>
+      <w:r>
+        <w:lastRenderedPageBreak/>
+        <w:t>The exact words aren't necessarily enough by themselves, but TF-IDF gives the classifier useful numerical representations of the email.</w:t>
+      </w:r>
+    </w:p>
+    <w:p>
+      <w:r>
+        <w:t xml:space="preserve">Another reason why SVM </w:t>
+      </w:r>
+      <w:r>
+        <w:t>worked well within detecting spam emails is the text features used. With this study SVM is working with 5000 text features, which SVM is well suited to as it is a variant of a high dimensional classification problem. With their paper, it explains that a linear SVM attempts to find a decision boundary that separates the two classes as much as possible while maximising the margin between spam and ham emails.</w:t>
+      </w:r>
+    </w:p>
+    <w:p>
+      <w:r>
+        <w:t>While TF-IDF is a big factor as to why the model performed as well as it did, there were several contributing factors such as the preprocessing process, the characteristics of the TREC 2007 dataset, dataset size and composition, class distribution, and their overall setup. This shows that it cant be simplified as to their method and model is better than this one as once again, different parameters are being implemented.</w:t>
+      </w:r>
+    </w:p>
+    <w:p>
+      <w:r>
+        <w:t xml:space="preserve">Another similarity that occurred between both papers is that external testing when using emails not involved within the dataset can affect the accuracy </w:t>
+      </w:r>
+      <w:r>
+        <w:t xml:space="preserve">and overall performance of the model. When testing the accuracy of this model using new created emails, the model went from 98.21% on the Kaggle test set to 86.67% on the external emails. The spam recall dropped from 87% to 73% as well. With Paper 2 </w:t>
+      </w:r>
+      <w:r>
+        <w:t>Kshirsagar M, Rathi V and Ryan C (2025)</w:t>
+      </w:r>
+      <w:r>
+        <w:t>. When testing the model on a different dataset, a hybrid dataset combining Enron-Spam and TREC 2007, the accuracy also dropped to 97.73%. This shows that performance can change when the distribution of the data changes.</w:t>
+      </w:r>
+    </w:p>
+    <w:p>
+      <w:r>
+        <w:t xml:space="preserve">To summarise Paper 2, </w:t>
+      </w:r>
+      <w:r>
+        <w:t>Kshirsagar, Rathi and Ryan (2025) investigated different machine learning and deep learning approaches for email spam detection. The study evaluated models including Logistic Regression, Naive Bayes, Random Forest, XGBoost and Support Vector Machine (SVM), using both Bag of Words and TF-IDF representations. The study used the TREC 2007 and Enron-Spam datasets, as well as a combined dataset, to evaluate how well the different approaches performed.</w:t>
+      </w:r>
+    </w:p>
+    <w:p>
+      <w:r>
+        <w:t>One of the most relevant findings for this project was the performance of SVM using TF-IDF. On the TREC 2007 dataset, SVM with TF-IDF achieved an accuracy of 99.11%, precision of 99.06%, recall of 99.60% and an F1 score of 99.33%. This was stronger than SVM using Bag of Words, which achieved an accuracy of 97.53%. The results therefore suggest that TF-IDF provided a useful representation for the SVM model when classifying spam emails.</w:t>
+      </w:r>
+    </w:p>
+    <w:p>
+      <w:r>
+        <w:t>The study also showed that model performance could change depending on the dataset being used. SVM with TF-IDF achieved lower performance when evaluated on the combined dataset compared with TREC 2007. This demonstrates the importance of considering the data used to train and evaluate a spam detection model, rather than assuming that a high accuracy on one dataset will automatically translate to other email data.</w:t>
+      </w:r>
+    </w:p>
+    <w:p>
+      <w:r>
+        <w:t>Overall, the paper demonstrates that SVM combined with TF-IDF can be highly effective for spam email classification. It is particularly relevant to this project because the same general approach was used in this study, allowing the performance of the SVM model developed in this project to be compared with results from previous research.</w:t>
+      </w:r>
+    </w:p>
+    <w:p>
+      <w:r>
+        <w:t xml:space="preserve">The purpose of comparing the results with previous research is therefore not simply to show that the model achieved a higher or lower accuracy. Instead, it helps determine whether the findings of this project are consistent with existing research and provides context for </w:t>
+      </w:r>
+      <w:r>
+        <w:lastRenderedPageBreak/>
+        <w:t>interpreting the results. The comparison also helps identify areas where this project contributes additional analysis. In particular, this project compared three different classifiers, performed hyperparameter tuning on the SVM and tested the final model on 30 independently created emails. While the SVM achieved 98.21% accuracy on the original test set, its accuracy decreased to 86.67% on the external emails. This demonstrates the importance of evaluating how well a model generalises beyond the dataset on which it was trained and tested.</w:t>
+      </w:r>
+    </w:p>
+    <w:p>
+      <w:r>
+        <w:t>Therefore, the literature comparison supports the findings of this project while also highlighting an important limitation of relying solely on performance metrics from a single dataset. The previous studies demonstrate that TF-IDF combined with traditional machine learning models can achieve high performance, while the external testing in this project provides further evidence that strong performance on a particular dataset does not necessarily guarantee the same level of performance on new email data.</w:t>
       </w:r>
     </w:p>
     <w:p/>

</xml_diff>

<commit_message>
talked about the editions i added
</commit_message>
<xml_diff>
--- a/Project Spam Email Detector.docx
+++ b/Project Spam Email Detector.docx
@@ -651,27 +651,14 @@
       <w:r>
         <w:t xml:space="preserve">Figure </w:t>
       </w:r>
-      <w:r>
-        <w:fldChar w:fldCharType="begin"/>
-      </w:r>
-      <w:r>
-        <w:instrText xml:space="preserve"> SEQ Figure \* ARABIC </w:instrText>
-      </w:r>
-      <w:r>
-        <w:fldChar w:fldCharType="separate"/>
-      </w:r>
-      <w:r>
-        <w:rPr>
-          <w:noProof/>
-        </w:rPr>
-        <w:t>1</w:t>
-      </w:r>
-      <w:r>
-        <w:rPr>
-          <w:noProof/>
-        </w:rPr>
-        <w:fldChar w:fldCharType="end"/>
-      </w:r>
+      <w:fldSimple w:instr=" SEQ Figure \* ARABIC ">
+        <w:r>
+          <w:rPr>
+            <w:noProof/>
+          </w:rPr>
+          <w:t>1</w:t>
+        </w:r>
+      </w:fldSimple>
       <w:r>
         <w:t xml:space="preserve"> containing number of emails vs spam emails sent</w:t>
       </w:r>
@@ -747,27 +734,14 @@
       <w:r>
         <w:t xml:space="preserve">Figure </w:t>
       </w:r>
-      <w:r>
-        <w:fldChar w:fldCharType="begin"/>
-      </w:r>
-      <w:r>
-        <w:instrText xml:space="preserve"> SEQ Figure \* ARABIC </w:instrText>
-      </w:r>
-      <w:r>
-        <w:fldChar w:fldCharType="separate"/>
-      </w:r>
-      <w:r>
-        <w:rPr>
-          <w:noProof/>
-        </w:rPr>
-        <w:t>2</w:t>
-      </w:r>
-      <w:r>
-        <w:rPr>
-          <w:noProof/>
-        </w:rPr>
-        <w:fldChar w:fldCharType="end"/>
-      </w:r>
+      <w:fldSimple w:instr=" SEQ Figure \* ARABIC ">
+        <w:r>
+          <w:rPr>
+            <w:noProof/>
+          </w:rPr>
+          <w:t>2</w:t>
+        </w:r>
+      </w:fldSimple>
       <w:r>
         <w:t xml:space="preserve"> the most common topics people see in spam emails they receive</w:t>
       </w:r>
@@ -831,27 +805,14 @@
       <w:r>
         <w:t xml:space="preserve">Figure </w:t>
       </w:r>
-      <w:r>
-        <w:fldChar w:fldCharType="begin"/>
-      </w:r>
-      <w:r>
-        <w:instrText xml:space="preserve"> SEQ Figure \* ARABIC </w:instrText>
-      </w:r>
-      <w:r>
-        <w:fldChar w:fldCharType="separate"/>
-      </w:r>
-      <w:r>
-        <w:rPr>
-          <w:noProof/>
-        </w:rPr>
-        <w:t>3</w:t>
-      </w:r>
-      <w:r>
-        <w:rPr>
-          <w:noProof/>
-        </w:rPr>
-        <w:fldChar w:fldCharType="end"/>
-      </w:r>
+      <w:fldSimple w:instr=" SEQ Figure \* ARABIC ">
+        <w:r>
+          <w:rPr>
+            <w:noProof/>
+          </w:rPr>
+          <w:t>3</w:t>
+        </w:r>
+      </w:fldSimple>
       <w:r>
         <w:t xml:space="preserve"> Average monthly spam call received by age and gender</w:t>
       </w:r>
@@ -958,27 +919,14 @@
       <w:r>
         <w:t xml:space="preserve">Figure </w:t>
       </w:r>
-      <w:r>
-        <w:fldChar w:fldCharType="begin"/>
-      </w:r>
-      <w:r>
-        <w:instrText xml:space="preserve"> SEQ Figure \* ARABIC </w:instrText>
-      </w:r>
-      <w:r>
-        <w:fldChar w:fldCharType="separate"/>
-      </w:r>
-      <w:r>
-        <w:rPr>
-          <w:noProof/>
-        </w:rPr>
-        <w:t>4</w:t>
-      </w:r>
-      <w:r>
-        <w:rPr>
-          <w:noProof/>
-        </w:rPr>
-        <w:fldChar w:fldCharType="end"/>
-      </w:r>
+      <w:fldSimple w:instr=" SEQ Figure \* ARABIC ">
+        <w:r>
+          <w:rPr>
+            <w:noProof/>
+          </w:rPr>
+          <w:t>4</w:t>
+        </w:r>
+      </w:fldSimple>
       <w:r>
         <w:t xml:space="preserve"> loading spam email dataset into my python file</w:t>
       </w:r>
@@ -1213,27 +1161,14 @@
       <w:r>
         <w:t xml:space="preserve">Figure </w:t>
       </w:r>
-      <w:r>
-        <w:fldChar w:fldCharType="begin"/>
-      </w:r>
-      <w:r>
-        <w:instrText xml:space="preserve"> SEQ Figure \* ARABIC </w:instrText>
-      </w:r>
-      <w:r>
-        <w:fldChar w:fldCharType="separate"/>
-      </w:r>
-      <w:r>
-        <w:rPr>
-          <w:noProof/>
-        </w:rPr>
-        <w:t>5</w:t>
-      </w:r>
-      <w:r>
-        <w:rPr>
-          <w:noProof/>
-        </w:rPr>
-        <w:fldChar w:fldCharType="end"/>
-      </w:r>
+      <w:fldSimple w:instr=" SEQ Figure \* ARABIC ">
+        <w:r>
+          <w:rPr>
+            <w:noProof/>
+          </w:rPr>
+          <w:t>5</w:t>
+        </w:r>
+      </w:fldSimple>
       <w:r>
         <w:t xml:space="preserve"> Bar chart showcasing the number of spam and ham emails</w:t>
       </w:r>
@@ -2102,15 +2037,7 @@
         <w:t>Punctuation analysis is important for this report as spam emails often use punctuation differently from legitimate emails. It is common practice within spam emails to use excessive punctuation to garner attention, create urgency, and encourage the recipient to take action immediately. For example, “</w:t>
       </w:r>
       <w:r>
-        <w:t xml:space="preserve">WINNER!! As a valued network customer you have been selected to </w:t>
-      </w:r>
-      <w:proofErr w:type="spellStart"/>
-      <w:r>
-        <w:t>receivea</w:t>
-      </w:r>
-      <w:proofErr w:type="spellEnd"/>
-      <w:r>
-        <w:t xml:space="preserve"> Â£900 prize reward! To claim call 09061701461. Claim code KL341. Valid 12 hours only.</w:t>
+        <w:t>WINNER!! As a valued network customer you have been selected to receivea Â£900 prize reward! To claim call 09061701461. Claim code KL341. Valid 12 hours only.</w:t>
       </w:r>
       <w:r>
         <w:t>” This is an example of a spam email within the dataset.</w:t>
@@ -2604,31 +2531,7 @@
         <w:t>Another way they are used within spam emails is in a more “direct” manner making a direct statement as such. For example, “</w:t>
       </w:r>
       <w:r>
-        <w:t xml:space="preserve">Want 2 get laid tonight? Want real Dogging locations sent direct 2 </w:t>
-      </w:r>
-      <w:proofErr w:type="spellStart"/>
-      <w:r>
-        <w:t>ur</w:t>
-      </w:r>
-      <w:proofErr w:type="spellEnd"/>
-      <w:r>
-        <w:t xml:space="preserve"> mob? Join the UK's largest Dogging Network </w:t>
-      </w:r>
-      <w:proofErr w:type="spellStart"/>
-      <w:r>
-        <w:t>bt</w:t>
-      </w:r>
-      <w:proofErr w:type="spellEnd"/>
-      <w:r>
-        <w:t xml:space="preserve"> </w:t>
-      </w:r>
-      <w:proofErr w:type="spellStart"/>
-      <w:r>
-        <w:t>Txting</w:t>
-      </w:r>
-      <w:proofErr w:type="spellEnd"/>
-      <w:r>
-        <w:t xml:space="preserve"> GRAVEL to 69888! Nt. ec2a. </w:t>
+        <w:t xml:space="preserve">Want 2 get laid tonight? Want real Dogging locations sent direct 2 ur mob? Join the UK's largest Dogging Network bt Txting GRAVEL to 69888! Nt. ec2a. </w:t>
       </w:r>
       <w:hyperlink r:id="rId29" w:history="1">
         <w:r>
@@ -2687,42 +2590,13 @@
         <w:t>“</w:t>
       </w:r>
       <w:r>
-        <w:t xml:space="preserve">Sunshine Quiz </w:t>
-      </w:r>
-      <w:proofErr w:type="spellStart"/>
-      <w:r>
-        <w:t>Wkly</w:t>
-      </w:r>
-      <w:proofErr w:type="spellEnd"/>
-      <w:r>
-        <w:t xml:space="preserve"> Q! Win a top Sony DVD player if u know which country the Algarve is in? Txt </w:t>
-      </w:r>
-      <w:proofErr w:type="spellStart"/>
-      <w:r>
-        <w:t>ansr</w:t>
-      </w:r>
-      <w:proofErr w:type="spellEnd"/>
-      <w:r>
-        <w:t xml:space="preserve"> to 82277. Â£1.50 </w:t>
-      </w:r>
-      <w:proofErr w:type="spellStart"/>
-      <w:r>
-        <w:t>SP:Tyrone</w:t>
-      </w:r>
-      <w:proofErr w:type="spellEnd"/>
+        <w:t>Sunshine Quiz Wkly Q! Win a top Sony DVD player if u know which country the Algarve is in? Txt ansr to 82277. Â£1.50 SP:Tyrone</w:t>
+      </w:r>
       <w:r>
         <w:t>”, “</w:t>
       </w:r>
       <w:r>
-        <w:t xml:space="preserve">You are a winner U have been specially selected 2 receive Â£1000 cash or a 4* holiday (flights </w:t>
-      </w:r>
-      <w:proofErr w:type="spellStart"/>
-      <w:r>
-        <w:t>inc</w:t>
-      </w:r>
-      <w:proofErr w:type="spellEnd"/>
-      <w:r>
-        <w:t>) speak to a live operator 2 claim 0871277810810</w:t>
+        <w:t>You are a winner U have been specially selected 2 receive Â£1000 cash or a 4* holiday (flights inc) speak to a live operator 2 claim 0871277810810</w:t>
       </w:r>
       <w:r>
         <w:t>”</w:t>
@@ -3167,15 +3041,7 @@
         <w:t>and a max of 40</w:t>
       </w:r>
       <w:r>
-        <w:t>. This shows that spam emails tend to be packed with numbers within its emails due to the content of it including prices, phone numbers, “you won £</w:t>
-      </w:r>
-      <w:proofErr w:type="spellStart"/>
-      <w:r>
-        <w:t>xxxx</w:t>
-      </w:r>
-      <w:proofErr w:type="spellEnd"/>
-      <w:r>
-        <w:t>”, etc.</w:t>
+        <w:t>. This shows that spam emails tend to be packed with numbers within its emails due to the content of it including prices, phone numbers, “you won £xxxx”, etc.</w:t>
       </w:r>
     </w:p>
     <w:p/>
@@ -3371,15 +3237,7 @@
         <w:pStyle w:val="Caption"/>
       </w:pPr>
       <w:r>
-        <w:t xml:space="preserve">Figure 30 output of the </w:t>
-      </w:r>
-      <w:proofErr w:type="spellStart"/>
-      <w:r>
-        <w:t>longest_number_length</w:t>
-      </w:r>
-      <w:proofErr w:type="spellEnd"/>
-      <w:r>
-        <w:t xml:space="preserve"> and comparison code block</w:t>
+        <w:t>Figure 30 output of the longest_number_length and comparison code block</w:t>
       </w:r>
     </w:p>
     <w:p>
@@ -3952,15 +3810,7 @@
         <w:t>What this code does is that it uses the regex module to be able to find specific text content within an email using re.findall(). First it find https text using https?. The question mark is added to mean that the s is optional. It then look for :// as that is an essential part of a link. Then I added \S+ which means to match every non-space character until a space appears, which means to combine https:// together alongside the potential site name as just one URL. For example: “</w:t>
       </w:r>
       <w:r>
-        <w:t xml:space="preserve">http://wap. </w:t>
-      </w:r>
-      <w:proofErr w:type="spellStart"/>
-      <w:r>
-        <w:t>xxxmobilemovieclub.com?n</w:t>
-      </w:r>
-      <w:proofErr w:type="spellEnd"/>
-      <w:r>
-        <w:t>=QJKGIGHJJGCBL</w:t>
+        <w:t>http://wap. xxxmobilemovieclub.com?n=QJKGIGHJJGCBL</w:t>
       </w:r>
       <w:r>
         <w:t>” this is one of the spam emails that have this within the dataset.</w:t>
@@ -4591,15 +4441,7 @@
     <w:p>
       <w:r>
         <w:lastRenderedPageBreak/>
-        <w:t xml:space="preserve">What it does is first converts the correlation matrix into an image with plt.imshow() where it will turn every number within the correlation matrix into a coloured square. </w:t>
-      </w:r>
-      <w:proofErr w:type="spellStart"/>
-      <w:r>
-        <w:t>cmap</w:t>
-      </w:r>
-      <w:proofErr w:type="spellEnd"/>
-      <w:r>
-        <w:t xml:space="preserve"> chooses the colour scheme. Plt.colorbar() adds the colour scale. Plt.xticks &amp; plt.yticks in this case adds labels to the x-axis and the same for the y-axis. </w:t>
+        <w:t xml:space="preserve">What it does is first converts the correlation matrix into an image with plt.imshow() where it will turn every number within the correlation matrix into a coloured square. cmap chooses the colour scheme. Plt.colorbar() adds the colour scale. Plt.xticks &amp; plt.yticks in this case adds labels to the x-axis and the same for the y-axis. </w:t>
       </w:r>
     </w:p>
     <w:p>
@@ -8438,15 +8280,7 @@
     </w:p>
     <w:p>
       <w:r>
-        <w:t xml:space="preserve"> The spread of spam emails presents serious problems for both email security and user experience. This research aims to develop an effective spam email classification system utilizing machine learning techniques, specifically Logistic Regression and Naive Bayes, within the Apache Spark framework. The methodology encompasses a thorough preprocessing of the Enron email dataset. This process involves several critical steps: text cleaning to remove irrelevant information, tokenization to break down the text into individual words, removal of stop words to eliminate common but uninformative words, and text feature extraction using Term Frequency-Inverse Document Frequency (TF-IDF) to quantify the importance of terms within the dataset. The study is conducted on a subset of the Enron email dataset, comprising 11,029 emails, with 2,996 </w:t>
-      </w:r>
-      <w:proofErr w:type="spellStart"/>
-      <w:r>
-        <w:t>labeled</w:t>
-      </w:r>
-      <w:proofErr w:type="spellEnd"/>
-      <w:r>
-        <w:t xml:space="preserve"> as spam. Experimental results demonstrate that the Naive Bayes model outperforms Logistic Regression, achieving higher accuracy and F1 score. This finding underscores the robustness of Naive Bayes in spam email classification, highlighting its potential for enhancing email security by effectively filtering spam.</w:t>
+        <w:t xml:space="preserve"> The spread of spam emails presents serious problems for both email security and user experience. This research aims to develop an effective spam email classification system utilizing machine learning techniques, specifically Logistic Regression and Naive Bayes, within the Apache Spark framework. The methodology encompasses a thorough preprocessing of the Enron email dataset. This process involves several critical steps: text cleaning to remove irrelevant information, tokenization to break down the text into individual words, removal of stop words to eliminate common but uninformative words, and text feature extraction using Term Frequency-Inverse Document Frequency (TF-IDF) to quantify the importance of terms within the dataset. The study is conducted on a subset of the Enron email dataset, comprising 11,029 emails, with 2,996 labeled as spam. Experimental results demonstrate that the Naive Bayes model outperforms Logistic Regression, achieving higher accuracy and F1 score. This finding underscores the robustness of Naive Bayes in spam email classification, highlighting its potential for enhancing email security by effectively filtering spam.</w:t>
       </w:r>
     </w:p>
     <w:p>
@@ -8490,6 +8324,9 @@
         <w:keepNext/>
       </w:pPr>
       <w:r>
+        <w:rPr>
+          <w:noProof/>
+        </w:rPr>
         <w:lastRenderedPageBreak/>
         <w:drawing>
           <wp:inline distT="0" distB="0" distL="0" distR="0" wp14:anchorId="31D1117F" wp14:editId="3C98FDAB">
@@ -9111,23 +8948,7 @@
     </w:p>
     <w:p>
       <w:r>
-        <w:t xml:space="preserve">Kshirsagar M, Rathi V and Ryan C (2025) Meta-learner-based frameworks for interpretable email spam detection. Front. </w:t>
-      </w:r>
-      <w:proofErr w:type="spellStart"/>
-      <w:r>
-        <w:t>Artif</w:t>
-      </w:r>
-      <w:proofErr w:type="spellEnd"/>
-      <w:r>
-        <w:t xml:space="preserve">. Intell. 8:1569804. </w:t>
-      </w:r>
-      <w:proofErr w:type="spellStart"/>
-      <w:r>
-        <w:t>doi</w:t>
-      </w:r>
-      <w:proofErr w:type="spellEnd"/>
-      <w:r>
-        <w:t>: 10.3389/frai.2025.1569804</w:t>
+        <w:t>Kshirsagar M, Rathi V and Ryan C (2025) Meta-learner-based frameworks for interpretable email spam detection. Front. Artif. Intell. 8:1569804. doi: 10.3389/frai.2025.1569804</w:t>
       </w:r>
     </w:p>
     <w:p>
@@ -9470,10 +9291,7 @@
     </w:p>
     <w:p>
       <w:r>
-        <w:t>C</w:t>
-      </w:r>
-      <w:r>
-        <w:t>ongratulations</w:t>
+        <w:t>Congratulations</w:t>
       </w:r>
       <w:r>
         <w:t xml:space="preserve">, </w:t>
@@ -9589,6 +9407,145 @@
       </w:r>
     </w:p>
     <w:p/>
+    <w:p>
+      <w:r>
+        <w:rPr>
+          <w:u w:val="single"/>
+        </w:rPr>
+        <w:t>Creating the Spam Detector Application:</w:t>
+      </w:r>
+      <w:r>
+        <w:rPr>
+          <w:u w:val="single"/>
+        </w:rPr>
+        <w:br/>
+      </w:r>
+    </w:p>
+    <w:p>
+      <w:r>
+        <w:t xml:space="preserve">Next, it was time to create the backend and frontend of the spam email detector. </w:t>
+      </w:r>
+    </w:p>
+    <w:p>
+      <w:r>
+        <w:t>For the backend, the choice was Flask due to the familiarity and ease of access it presented it self as.</w:t>
+      </w:r>
+    </w:p>
+    <w:p>
+      <w:pPr>
+        <w:keepNext/>
+      </w:pPr>
+      <w:r>
+        <w:drawing>
+          <wp:inline distT="0" distB="0" distL="0" distR="0" wp14:anchorId="3144D94C" wp14:editId="229550E2">
+            <wp:extent cx="3560748" cy="1587500"/>
+            <wp:effectExtent l="0" t="0" r="1905" b="0"/>
+            <wp:docPr id="1928400665" name="Picture 1"/>
+            <wp:cNvGraphicFramePr>
+              <a:graphicFrameLocks xmlns:a="http://schemas.openxmlformats.org/drawingml/2006/main" noChangeAspect="1"/>
+            </wp:cNvGraphicFramePr>
+            <a:graphic xmlns:a="http://schemas.openxmlformats.org/drawingml/2006/main">
+              <a:graphicData uri="http://schemas.openxmlformats.org/drawingml/2006/picture">
+                <pic:pic xmlns:pic="http://schemas.openxmlformats.org/drawingml/2006/picture">
+                  <pic:nvPicPr>
+                    <pic:cNvPr id="1928400665" name=""/>
+                    <pic:cNvPicPr/>
+                  </pic:nvPicPr>
+                  <pic:blipFill>
+                    <a:blip r:embed="rId99"/>
+                    <a:stretch>
+                      <a:fillRect/>
+                    </a:stretch>
+                  </pic:blipFill>
+                  <pic:spPr>
+                    <a:xfrm>
+                      <a:off x="0" y="0"/>
+                      <a:ext cx="3563543" cy="1588746"/>
+                    </a:xfrm>
+                    <a:prstGeom prst="rect">
+                      <a:avLst/>
+                    </a:prstGeom>
+                  </pic:spPr>
+                </pic:pic>
+              </a:graphicData>
+            </a:graphic>
+          </wp:inline>
+        </w:drawing>
+      </w:r>
+    </w:p>
+    <w:p>
+      <w:pPr>
+        <w:pStyle w:val="Caption"/>
+      </w:pPr>
+      <w:r>
+        <w:t>Figure 97 importing flask module, and Json</w:t>
+      </w:r>
+    </w:p>
+    <w:p/>
+    <w:p>
+      <w:r>
+        <w:t>With the figure above, it shows various modules such as Flask and Json being imported in order to code the logic for the backend. Joblib is another module being imported to the app.py file as it is used to load the SVM model and training data that was used in the spam_analysis.py file, where all the work was done to find that SVM was the most optimal model and more.</w:t>
+      </w:r>
+    </w:p>
+    <w:p>
+      <w:pPr>
+        <w:keepNext/>
+      </w:pPr>
+      <w:r>
+        <w:lastRenderedPageBreak/>
+        <w:drawing>
+          <wp:inline distT="0" distB="0" distL="0" distR="0" wp14:anchorId="7999AC76" wp14:editId="2EA8804C">
+            <wp:extent cx="3727450" cy="2972606"/>
+            <wp:effectExtent l="0" t="0" r="6350" b="0"/>
+            <wp:docPr id="1728293139" name="Picture 1"/>
+            <wp:cNvGraphicFramePr>
+              <a:graphicFrameLocks xmlns:a="http://schemas.openxmlformats.org/drawingml/2006/main" noChangeAspect="1"/>
+            </wp:cNvGraphicFramePr>
+            <a:graphic xmlns:a="http://schemas.openxmlformats.org/drawingml/2006/main">
+              <a:graphicData uri="http://schemas.openxmlformats.org/drawingml/2006/picture">
+                <pic:pic xmlns:pic="http://schemas.openxmlformats.org/drawingml/2006/picture">
+                  <pic:nvPicPr>
+                    <pic:cNvPr id="1728293139" name=""/>
+                    <pic:cNvPicPr/>
+                  </pic:nvPicPr>
+                  <pic:blipFill>
+                    <a:blip r:embed="rId100"/>
+                    <a:stretch>
+                      <a:fillRect/>
+                    </a:stretch>
+                  </pic:blipFill>
+                  <pic:spPr>
+                    <a:xfrm>
+                      <a:off x="0" y="0"/>
+                      <a:ext cx="3781652" cy="3015831"/>
+                    </a:xfrm>
+                    <a:prstGeom prst="rect">
+                      <a:avLst/>
+                    </a:prstGeom>
+                  </pic:spPr>
+                </pic:pic>
+              </a:graphicData>
+            </a:graphic>
+          </wp:inline>
+        </w:drawing>
+      </w:r>
+    </w:p>
+    <w:p>
+      <w:pPr>
+        <w:pStyle w:val="Caption"/>
+      </w:pPr>
+      <w:r>
+        <w:t>Figure 98 predict function to see if email is ham or spam</w:t>
+      </w:r>
+    </w:p>
+    <w:p>
+      <w:r>
+        <w:t>This block of code here in functioned to take an email that the user inputted and will send back a response which consists of Ham or Spam. With data = request.get_json(), this gets the JSON data that the user sends to the API; in this case the data is the email text contents</w:t>
+      </w:r>
+      <w:r>
+        <w:t>. With the next line within the code, it involves converting the email using the TF-IDF vectorizer that was used during the training of models. After a prediction is made with [0] meaning that predict returns an array. Next is using an if loop to see if the prediction is spam or legitimate, if the prediction equals o 1, the result is spam, if it is not, it will return Ham.</w:t>
+      </w:r>
+    </w:p>
     <w:sectPr>
       <w:pgSz w:w="11906" w:h="16838"/>
       <w:pgMar w:top="1440" w:right="1440" w:bottom="1440" w:left="1440" w:header="708" w:footer="708" w:gutter="0"/>
@@ -10581,6 +10538,7 @@
   <w:style w:type="character" w:default="1" w:styleId="DefaultParagraphFont">
     <w:name w:val="Default Paragraph Font"/>
     <w:uiPriority w:val="1"/>
+    <w:semiHidden/>
     <w:unhideWhenUsed/>
   </w:style>
   <w:style w:type="table" w:default="1" w:styleId="TableNormal">

</xml_diff>